<commit_message>
feat: capturar whatsapp no onboarding, correcao turnstile captcha, horas gerais do canal e insights condicionais
</commit_message>
<xml_diff>
--- a/Contrato/CONTRATO_COSMO_ALMA_TV_V3.docx
+++ b/Contrato/CONTRATO_COSMO_ALMA_TV_V3.docx
@@ -35,6 +35,13 @@
           <w:vertAlign w:val="baseline"/>
         </w:rPr>
       </w:pPr>
+      <w:r>
+        <w:rPr>
+          <w:color w:val="000000"/>
+          <w:rtl w:val="0"/>
+        </w:rPr>
+        <w:t xml:space="preserve"> </w:t>
+      </w:r>
       <w:r>
         <w:rPr>
           <w:rtl w:val="0"/>
@@ -1991,7 +1998,7 @@
 
 <file path=customXML/item1.xml><?xml version="1.0" encoding="utf-8"?>
 <go:gDocsCustomXmlDataStorage xmlns:go="http://customooxmlschemas.google.com/" xmlns:r="http://schemas.openxmlformats.org/officeDocument/2006/relationships" uri="GoogleDocsCustomDataVersion2">
-  <go:docsCustomData xmlns:go="http://customooxmlschemas.google.com/" roundtripDataSignature="AMtx7mgLV+whCBYs8JTNi+x7TBkWDnu32A==">CgMxLjA4AHIhMWRKeFJWYmtkQnZ4S1YtZy1KOGZURFdUR3BlWVdsUEVp</go:docsCustomData>
+  <go:docsCustomData xmlns:go="http://customooxmlschemas.google.com/" roundtripDataSignature="AMtx7mhb5j4k5qPeuceQs79U/tEIyrhnrA==">CgMxLjA4AHIhMUsyLXhqYlNBd3pFQUVleFJjelJ3bHFXUjZZalNwOUYw</go:docsCustomData>
 </go:gDocsCustomXmlDataStorage>
 </file>
 

</xml_diff>